<commit_message>
Use correct date for message in Docx export
Replace the creation date with the displayed date property, make sure
its timezone aware so that we have the same value as the HTML page.
</commit_message>
<xml_diff>
--- a/core/doc_templates/bloc_commun.docx
+++ b/core/doc_templates/bloc_commun.docx
@@ -47,8 +47,8 @@
         <w:gridCol w:w="1358"/>
         <w:gridCol w:w="1902"/>
         <w:gridCol w:w="5528"/>
-        <w:gridCol w:w="2273"/>
-        <w:gridCol w:w="986"/>
+        <w:gridCol w:w="2275"/>
+        <w:gridCol w:w="984"/>
       </w:tblGrid>
       <w:tr>
         <w:trPr/>
@@ -264,7 +264,7 @@
         </w:tc>
         <w:tc>
           <w:tcPr>
-            <w:tcW w:w="2273" w:type="dxa"/>
+            <w:tcW w:w="2275" w:type="dxa"/>
             <w:tcBorders>
               <w:top w:val="single" w:sz="4" w:space="0" w:color="000000"/>
               <w:left w:val="single" w:sz="4" w:space="0" w:color="000000"/>
@@ -299,7 +299,7 @@
         </w:tc>
         <w:tc>
           <w:tcPr>
-            <w:tcW w:w="986" w:type="dxa"/>
+            <w:tcW w:w="984" w:type="dxa"/>
             <w:tcBorders>
               <w:top w:val="single" w:sz="4" w:space="0" w:color="000000"/>
               <w:left w:val="single" w:sz="4" w:space="0" w:color="000000"/>
@@ -401,7 +401,23 @@
                 <w:sz w:val="20"/>
                 <w:szCs w:val="20"/>
               </w:rPr>
-              <w:t>{{item.date_creation.strftime("%Y-%m-%d %H:%M")}}</w:t>
+              <w:t>{{item.</w:t>
+            </w:r>
+            <w:r>
+              <w:rPr>
+                <w:rFonts w:cs="Calibri" w:ascii="Calibri" w:hAnsi="Calibri" w:asciiTheme="minorHAnsi" w:cstheme="minorHAnsi" w:hAnsiTheme="minorHAnsi"/>
+                <w:sz w:val="20"/>
+                <w:szCs w:val="20"/>
+              </w:rPr>
+              <w:t>displayed_date.</w:t>
+            </w:r>
+            <w:r>
+              <w:rPr>
+                <w:rFonts w:cs="Calibri" w:ascii="Calibri" w:hAnsi="Calibri" w:asciiTheme="minorHAnsi" w:cstheme="minorHAnsi" w:hAnsiTheme="minorHAnsi"/>
+                <w:sz w:val="20"/>
+                <w:szCs w:val="20"/>
+              </w:rPr>
+              <w:t>strftime("%Y-%m-%d %H:%M")}}</w:t>
             </w:r>
           </w:p>
         </w:tc>
@@ -679,45 +695,13 @@
                 <w:sz w:val="20"/>
                 <w:szCs w:val="20"/>
               </w:rPr>
-              <w:t>{{</w:t>
-            </w:r>
-            <w:r>
-              <w:rPr>
-                <w:rFonts w:cs="Calibri" w:ascii="Calibri" w:hAnsi="Calibri" w:asciiTheme="minorHAnsi" w:cstheme="minorHAnsi" w:hAnsiTheme="minorHAnsi"/>
-                <w:sz w:val="20"/>
-                <w:szCs w:val="20"/>
-              </w:rPr>
-              <w:t xml:space="preserve">r </w:t>
-            </w:r>
-            <w:r>
-              <w:rPr>
-                <w:rFonts w:cs="Calibri" w:ascii="Calibri" w:hAnsi="Calibri" w:asciiTheme="minorHAnsi" w:cstheme="minorHAnsi" w:hAnsiTheme="minorHAnsi"/>
-                <w:sz w:val="20"/>
-                <w:szCs w:val="20"/>
-              </w:rPr>
-              <w:t>item.</w:t>
-            </w:r>
-            <w:r>
-              <w:rPr>
-                <w:rFonts w:cs="Calibri" w:ascii="Calibri" w:hAnsi="Calibri" w:asciiTheme="minorHAnsi" w:cstheme="minorHAnsi" w:hAnsiTheme="minorHAnsi"/>
-                <w:sz w:val="20"/>
-                <w:szCs w:val="20"/>
-              </w:rPr>
-              <w:t>rt_content</w:t>
-            </w:r>
-            <w:r>
-              <w:rPr>
-                <w:rFonts w:cs="Calibri" w:ascii="Calibri" w:hAnsi="Calibri" w:asciiTheme="minorHAnsi" w:cstheme="minorHAnsi" w:hAnsiTheme="minorHAnsi"/>
-                <w:sz w:val="20"/>
-                <w:szCs w:val="20"/>
-              </w:rPr>
-              <w:t>}}</w:t>
-            </w:r>
-          </w:p>
-        </w:tc>
-        <w:tc>
-          <w:tcPr>
-            <w:tcW w:w="2273" w:type="dxa"/>
+              <w:t>{{r item.rt_content}}</w:t>
+            </w:r>
+          </w:p>
+        </w:tc>
+        <w:tc>
+          <w:tcPr>
+            <w:tcW w:w="2275" w:type="dxa"/>
             <w:tcBorders>
               <w:top w:val="single" w:sz="4" w:space="0" w:color="000000"/>
               <w:left w:val="single" w:sz="4" w:space="0" w:color="000000"/>
@@ -803,7 +787,7 @@
         </w:tc>
         <w:tc>
           <w:tcPr>
-            <w:tcW w:w="986" w:type="dxa"/>
+            <w:tcW w:w="984" w:type="dxa"/>
             <w:tcBorders>
               <w:top w:val="single" w:sz="4" w:space="0" w:color="000000"/>
               <w:left w:val="single" w:sz="4" w:space="0" w:color="000000"/>
@@ -975,7 +959,7 @@
             <w:tblPr>
               <w:tblW w:w="6060" w:type="dxa"/>
               <w:jc w:val="left"/>
-              <w:tblInd w:w="355" w:type="dxa"/>
+              <w:tblInd w:w="415" w:type="dxa"/>
               <w:tblLayout w:type="fixed"/>
               <w:tblCellMar>
                 <w:top w:w="55" w:type="dxa"/>

</xml_diff>